<commit_message>
Week05: trim audit appendix from answers.docx
</commit_message>
<xml_diff>
--- a/03_data_quality_cleaning/answers.docx
+++ b/03_data_quality_cleaning/answers.docx
@@ -8140,1088 +8140,6 @@
         </w:rPr>
         <w:t xml:space="preserve"> — ที่ลบมีเพียงแถวซ้ำทั้งแถว 18 แถว ส่วนที่เหลือติด flag ไว้ทั้งหมด</w:t>
       </w:r>
-    </w:p>
-    <w:p>
-      <w:pPr>
-        <w:pStyle w:val="Heading1"/>
-      </w:pPr>
-      <w:r>
-        <w:rPr>
-          <w:rFonts w:ascii="Tahoma" w:hAnsi="Tahoma" w:cs="Tahoma"/>
-          <w:color w:val="000000"/>
-        </w:rPr>
-        <w:t>ภาคผนวก — คอลัมน์ Audit ในไฟล์ผลลัพธ์</w:t>
-      </w:r>
-    </w:p>
-    <w:p>
-      <w:r>
-        <w:rPr>
-          <w:rFonts w:ascii="Consolas" w:hAnsi="Consolas" w:cs="Consolas"/>
-          <w:color w:val="000000"/>
-          <w:sz w:val="20"/>
-        </w:rPr>
-        <w:t>e_commerce_clean.csv</w:t>
-      </w:r>
-      <w:r>
-        <w:rPr>
-          <w:rFonts w:ascii="Tahoma" w:hAnsi="Tahoma" w:cs="Tahoma"/>
-          <w:color w:val="000000"/>
-        </w:rPr>
-        <w:t xml:space="preserve"> เพิ่มคอลัมน์ร่องรอยไว้ 20 คอลัมน์ (16 → 36) เพื่อให้ตรวจย้อนได้ว่าแถวไหนถูกแตะ และด้วยเหตุผลใด จำนวนที่แสดงคือจำนวนแถวหลังลบแถวซ้ำแล้ว</w:t>
-      </w:r>
-    </w:p>
-    <w:tbl>
-      <w:tblPr>
-        <w:tblStyle w:val="TableGrid"/>
-        <w:tblW w:type="auto" w:w="0"/>
-        <w:jc w:val="center"/>
-        <w:tblLook w:firstColumn="1" w:firstRow="1" w:lastColumn="0" w:lastRow="0" w:noHBand="0" w:noVBand="1" w:val="04A0"/>
-      </w:tblPr>
-      <w:tblGrid>
-        <w:gridCol w:w="3286"/>
-        <w:gridCol w:w="3286"/>
-        <w:gridCol w:w="3286"/>
-      </w:tblGrid>
-      <w:tr>
-        <w:tc>
-          <w:tcPr>
-            <w:tcW w:type="dxa" w:w="3628"/>
-          </w:tcPr>
-          <w:p>
-            <w:pPr>
-              <w:spacing w:after="40"/>
-            </w:pPr>
-            <w:r>
-              <w:rPr>
-                <w:rFonts w:ascii="Tahoma" w:hAnsi="Tahoma" w:cs="Tahoma"/>
-                <w:b/>
-                <w:color w:val="000000"/>
-                <w:sz w:val="19"/>
-              </w:rPr>
-              <w:t>คอลัมน์</w:t>
-            </w:r>
-          </w:p>
-        </w:tc>
-        <w:tc>
-          <w:tcPr>
-            <w:tcW w:type="dxa" w:w="4195"/>
-          </w:tcPr>
-          <w:p>
-            <w:pPr>
-              <w:spacing w:after="40"/>
-            </w:pPr>
-            <w:r>
-              <w:rPr>
-                <w:rFonts w:ascii="Tahoma" w:hAnsi="Tahoma" w:cs="Tahoma"/>
-                <w:b/>
-                <w:color w:val="000000"/>
-                <w:sz w:val="19"/>
-              </w:rPr>
-              <w:t>ความหมาย</w:t>
-            </w:r>
-          </w:p>
-        </w:tc>
-        <w:tc>
-          <w:tcPr>
-            <w:tcW w:type="dxa" w:w="1701"/>
-          </w:tcPr>
-          <w:p>
-            <w:pPr>
-              <w:spacing w:after="40"/>
-            </w:pPr>
-            <w:r>
-              <w:rPr>
-                <w:rFonts w:ascii="Tahoma" w:hAnsi="Tahoma" w:cs="Tahoma"/>
-                <w:b/>
-                <w:color w:val="000000"/>
-                <w:sz w:val="19"/>
-              </w:rPr>
-              <w:t>จำนวนแถวที่ติด</w:t>
-            </w:r>
-          </w:p>
-        </w:tc>
-      </w:tr>
-      <w:tr>
-        <w:tc>
-          <w:tcPr>
-            <w:tcW w:type="dxa" w:w="3628"/>
-          </w:tcPr>
-          <w:p>
-            <w:pPr>
-              <w:spacing w:after="40"/>
-            </w:pPr>
-            <w:r>
-              <w:rPr>
-                <w:rFonts w:ascii="Consolas" w:hAnsi="Consolas" w:cs="Consolas"/>
-                <w:color w:val="000000"/>
-                <w:sz w:val="19"/>
-              </w:rPr>
-              <w:t>Customer_Email_Was_Missing</w:t>
-            </w:r>
-          </w:p>
-        </w:tc>
-        <w:tc>
-          <w:tcPr>
-            <w:tcW w:type="dxa" w:w="4195"/>
-          </w:tcPr>
-          <w:p>
-            <w:pPr>
-              <w:spacing w:after="40"/>
-            </w:pPr>
-            <w:r>
-              <w:rPr>
-                <w:rFonts w:ascii="Tahoma" w:hAnsi="Tahoma" w:cs="Tahoma"/>
-                <w:color w:val="000000"/>
-                <w:sz w:val="19"/>
-              </w:rPr>
-              <w:t>อีเมลว่างในข้อมูลดิบ</w:t>
-            </w:r>
-          </w:p>
-        </w:tc>
-        <w:tc>
-          <w:tcPr>
-            <w:tcW w:type="dxa" w:w="1701"/>
-          </w:tcPr>
-          <w:p>
-            <w:pPr>
-              <w:spacing w:after="40"/>
-            </w:pPr>
-            <w:r>
-              <w:rPr>
-                <w:rFonts w:ascii="Tahoma" w:hAnsi="Tahoma" w:cs="Tahoma"/>
-                <w:color w:val="000000"/>
-                <w:sz w:val="19"/>
-              </w:rPr>
-              <w:t>48</w:t>
-            </w:r>
-          </w:p>
-        </w:tc>
-      </w:tr>
-      <w:tr>
-        <w:tc>
-          <w:tcPr>
-            <w:tcW w:type="dxa" w:w="3628"/>
-          </w:tcPr>
-          <w:p>
-            <w:pPr>
-              <w:spacing w:after="40"/>
-            </w:pPr>
-            <w:r>
-              <w:rPr>
-                <w:rFonts w:ascii="Consolas" w:hAnsi="Consolas" w:cs="Consolas"/>
-                <w:color w:val="000000"/>
-                <w:sz w:val="19"/>
-              </w:rPr>
-              <w:t>Customer_Email_Filled_From_Reference</w:t>
-            </w:r>
-          </w:p>
-        </w:tc>
-        <w:tc>
-          <w:tcPr>
-            <w:tcW w:type="dxa" w:w="4195"/>
-          </w:tcPr>
-          <w:p>
-            <w:pPr>
-              <w:spacing w:after="40"/>
-            </w:pPr>
-            <w:r>
-              <w:rPr>
-                <w:rFonts w:ascii="Tahoma" w:hAnsi="Tahoma" w:cs="Tahoma"/>
-                <w:color w:val="000000"/>
-                <w:sz w:val="19"/>
-              </w:rPr>
-              <w:t>เติมอีเมลจาก reference table ได้</w:t>
-            </w:r>
-          </w:p>
-        </w:tc>
-        <w:tc>
-          <w:tcPr>
-            <w:tcW w:type="dxa" w:w="1701"/>
-          </w:tcPr>
-          <w:p>
-            <w:pPr>
-              <w:spacing w:after="40"/>
-            </w:pPr>
-            <w:r>
-              <w:rPr>
-                <w:rFonts w:ascii="Tahoma" w:hAnsi="Tahoma" w:cs="Tahoma"/>
-                <w:color w:val="000000"/>
-                <w:sz w:val="19"/>
-              </w:rPr>
-              <w:t>45</w:t>
-            </w:r>
-          </w:p>
-        </w:tc>
-      </w:tr>
-      <w:tr>
-        <w:tc>
-          <w:tcPr>
-            <w:tcW w:type="dxa" w:w="3628"/>
-          </w:tcPr>
-          <w:p>
-            <w:pPr>
-              <w:spacing w:after="40"/>
-            </w:pPr>
-            <w:r>
-              <w:rPr>
-                <w:rFonts w:ascii="Consolas" w:hAnsi="Consolas" w:cs="Consolas"/>
-                <w:color w:val="000000"/>
-                <w:sz w:val="19"/>
-              </w:rPr>
-              <w:t>Province_Was_Missing</w:t>
-            </w:r>
-          </w:p>
-        </w:tc>
-        <w:tc>
-          <w:tcPr>
-            <w:tcW w:type="dxa" w:w="4195"/>
-          </w:tcPr>
-          <w:p>
-            <w:pPr>
-              <w:spacing w:after="40"/>
-            </w:pPr>
-            <w:r>
-              <w:rPr>
-                <w:rFonts w:ascii="Tahoma" w:hAnsi="Tahoma" w:cs="Tahoma"/>
-                <w:color w:val="000000"/>
-                <w:sz w:val="19"/>
-              </w:rPr>
-              <w:t>จังหวัดว่างในข้อมูลดิบ</w:t>
-            </w:r>
-          </w:p>
-        </w:tc>
-        <w:tc>
-          <w:tcPr>
-            <w:tcW w:type="dxa" w:w="1701"/>
-          </w:tcPr>
-          <w:p>
-            <w:pPr>
-              <w:spacing w:after="40"/>
-            </w:pPr>
-            <w:r>
-              <w:rPr>
-                <w:rFonts w:ascii="Tahoma" w:hAnsi="Tahoma" w:cs="Tahoma"/>
-                <w:color w:val="000000"/>
-                <w:sz w:val="19"/>
-              </w:rPr>
-              <w:t>12</w:t>
-            </w:r>
-          </w:p>
-        </w:tc>
-      </w:tr>
-      <w:tr>
-        <w:tc>
-          <w:tcPr>
-            <w:tcW w:type="dxa" w:w="3628"/>
-          </w:tcPr>
-          <w:p>
-            <w:pPr>
-              <w:spacing w:after="40"/>
-            </w:pPr>
-            <w:r>
-              <w:rPr>
-                <w:rFonts w:ascii="Consolas" w:hAnsi="Consolas" w:cs="Consolas"/>
-                <w:color w:val="000000"/>
-                <w:sz w:val="19"/>
-              </w:rPr>
-              <w:t>Province_Filled_From_Reference</w:t>
-            </w:r>
-          </w:p>
-        </w:tc>
-        <w:tc>
-          <w:tcPr>
-            <w:tcW w:type="dxa" w:w="4195"/>
-          </w:tcPr>
-          <w:p>
-            <w:pPr>
-              <w:spacing w:after="40"/>
-            </w:pPr>
-            <w:r>
-              <w:rPr>
-                <w:rFonts w:ascii="Tahoma" w:hAnsi="Tahoma" w:cs="Tahoma"/>
-                <w:color w:val="000000"/>
-                <w:sz w:val="19"/>
-              </w:rPr>
-              <w:t>เติมจังหวัดจาก reference table ได้</w:t>
-            </w:r>
-          </w:p>
-        </w:tc>
-        <w:tc>
-          <w:tcPr>
-            <w:tcW w:type="dxa" w:w="1701"/>
-          </w:tcPr>
-          <w:p>
-            <w:pPr>
-              <w:spacing w:after="40"/>
-            </w:pPr>
-            <w:r>
-              <w:rPr>
-                <w:rFonts w:ascii="Tahoma" w:hAnsi="Tahoma" w:cs="Tahoma"/>
-                <w:color w:val="000000"/>
-                <w:sz w:val="19"/>
-              </w:rPr>
-              <w:t>8</w:t>
-            </w:r>
-          </w:p>
-        </w:tc>
-      </w:tr>
-      <w:tr>
-        <w:tc>
-          <w:tcPr>
-            <w:tcW w:type="dxa" w:w="3628"/>
-          </w:tcPr>
-          <w:p>
-            <w:pPr>
-              <w:spacing w:after="40"/>
-            </w:pPr>
-            <w:r>
-              <w:rPr>
-                <w:rFonts w:ascii="Consolas" w:hAnsi="Consolas" w:cs="Consolas"/>
-                <w:color w:val="000000"/>
-                <w:sz w:val="19"/>
-              </w:rPr>
-              <w:t>Order_Date_Raw</w:t>
-            </w:r>
-            <w:r>
-              <w:rPr>
-                <w:rFonts w:ascii="Tahoma" w:hAnsi="Tahoma" w:cs="Tahoma"/>
-                <w:color w:val="000000"/>
-                <w:sz w:val="19"/>
-              </w:rPr>
-              <w:t xml:space="preserve"> / </w:t>
-            </w:r>
-            <w:r>
-              <w:rPr>
-                <w:rFonts w:ascii="Consolas" w:hAnsi="Consolas" w:cs="Consolas"/>
-                <w:color w:val="000000"/>
-                <w:sz w:val="19"/>
-              </w:rPr>
-              <w:t>Order_Date_Parse_Method</w:t>
-            </w:r>
-          </w:p>
-        </w:tc>
-        <w:tc>
-          <w:tcPr>
-            <w:tcW w:type="dxa" w:w="4195"/>
-          </w:tcPr>
-          <w:p>
-            <w:pPr>
-              <w:spacing w:after="40"/>
-            </w:pPr>
-            <w:r>
-              <w:rPr>
-                <w:rFonts w:ascii="Tahoma" w:hAnsi="Tahoma" w:cs="Tahoma"/>
-                <w:color w:val="000000"/>
-                <w:sz w:val="19"/>
-              </w:rPr>
-              <w:t>ค่าเดิมของวันที่ และวิธีที่ใช้ตัดสิน</w:t>
-            </w:r>
-          </w:p>
-        </w:tc>
-        <w:tc>
-          <w:tcPr>
-            <w:tcW w:type="dxa" w:w="1701"/>
-          </w:tcPr>
-          <w:p>
-            <w:pPr>
-              <w:spacing w:after="40"/>
-            </w:pPr>
-            <w:r>
-              <w:rPr>
-                <w:rFonts w:ascii="Tahoma" w:hAnsi="Tahoma" w:cs="Tahoma"/>
-                <w:color w:val="000000"/>
-                <w:sz w:val="19"/>
-              </w:rPr>
-              <w:t>ทุกแถว</w:t>
-            </w:r>
-          </w:p>
-        </w:tc>
-      </w:tr>
-      <w:tr>
-        <w:tc>
-          <w:tcPr>
-            <w:tcW w:type="dxa" w:w="3628"/>
-          </w:tcPr>
-          <w:p>
-            <w:pPr>
-              <w:spacing w:after="40"/>
-            </w:pPr>
-            <w:r>
-              <w:rPr>
-                <w:rFonts w:ascii="Consolas" w:hAnsi="Consolas" w:cs="Consolas"/>
-                <w:color w:val="000000"/>
-                <w:sz w:val="19"/>
-              </w:rPr>
-              <w:t>Order_Date_Was_Imputed</w:t>
-            </w:r>
-          </w:p>
-        </w:tc>
-        <w:tc>
-          <w:tcPr>
-            <w:tcW w:type="dxa" w:w="4195"/>
-          </w:tcPr>
-          <w:p>
-            <w:pPr>
-              <w:spacing w:after="40"/>
-            </w:pPr>
-            <w:r>
-              <w:rPr>
-                <w:rFonts w:ascii="Tahoma" w:hAnsi="Tahoma" w:cs="Tahoma"/>
-                <w:color w:val="000000"/>
-                <w:sz w:val="19"/>
-              </w:rPr>
-              <w:t xml:space="preserve">วันที่อ่านไม่ได้ ต้องใช้ </w:t>
-            </w:r>
-            <w:r>
-              <w:rPr>
-                <w:rFonts w:ascii="Consolas" w:hAnsi="Consolas" w:cs="Consolas"/>
-                <w:color w:val="000000"/>
-                <w:sz w:val="19"/>
-              </w:rPr>
-              <w:t>Load_Timestamp</w:t>
-            </w:r>
-            <w:r>
-              <w:rPr>
-                <w:rFonts w:ascii="Tahoma" w:hAnsi="Tahoma" w:cs="Tahoma"/>
-                <w:color w:val="000000"/>
-                <w:sz w:val="19"/>
-              </w:rPr>
-              <w:t xml:space="preserve"> แทน</w:t>
-            </w:r>
-          </w:p>
-        </w:tc>
-        <w:tc>
-          <w:tcPr>
-            <w:tcW w:type="dxa" w:w="1701"/>
-          </w:tcPr>
-          <w:p>
-            <w:pPr>
-              <w:spacing w:after="40"/>
-            </w:pPr>
-            <w:r>
-              <w:rPr>
-                <w:rFonts w:ascii="Tahoma" w:hAnsi="Tahoma" w:cs="Tahoma"/>
-                <w:color w:val="000000"/>
-                <w:sz w:val="19"/>
-              </w:rPr>
-              <w:t>7</w:t>
-            </w:r>
-          </w:p>
-        </w:tc>
-      </w:tr>
-      <w:tr>
-        <w:tc>
-          <w:tcPr>
-            <w:tcW w:type="dxa" w:w="3628"/>
-          </w:tcPr>
-          <w:p>
-            <w:pPr>
-              <w:spacing w:after="40"/>
-            </w:pPr>
-            <w:r>
-              <w:rPr>
-                <w:rFonts w:ascii="Consolas" w:hAnsi="Consolas" w:cs="Consolas"/>
-                <w:color w:val="000000"/>
-                <w:sz w:val="19"/>
-              </w:rPr>
-              <w:t>Customer_Name_Normalized</w:t>
-            </w:r>
-          </w:p>
-        </w:tc>
-        <w:tc>
-          <w:tcPr>
-            <w:tcW w:type="dxa" w:w="4195"/>
-          </w:tcPr>
-          <w:p>
-            <w:pPr>
-              <w:spacing w:after="40"/>
-            </w:pPr>
-            <w:r>
-              <w:rPr>
-                <w:rFonts w:ascii="Tahoma" w:hAnsi="Tahoma" w:cs="Tahoma"/>
-                <w:color w:val="000000"/>
-                <w:sz w:val="19"/>
-              </w:rPr>
-              <w:t>ชื่อที่ normalize แล้ว ใช้จับ near duplicate</w:t>
-            </w:r>
-          </w:p>
-        </w:tc>
-        <w:tc>
-          <w:tcPr>
-            <w:tcW w:type="dxa" w:w="1701"/>
-          </w:tcPr>
-          <w:p>
-            <w:pPr>
-              <w:spacing w:after="40"/>
-            </w:pPr>
-            <w:r>
-              <w:rPr>
-                <w:rFonts w:ascii="Tahoma" w:hAnsi="Tahoma" w:cs="Tahoma"/>
-                <w:color w:val="000000"/>
-                <w:sz w:val="19"/>
-              </w:rPr>
-              <w:t>ทุกแถว</w:t>
-            </w:r>
-          </w:p>
-        </w:tc>
-      </w:tr>
-      <w:tr>
-        <w:tc>
-          <w:tcPr>
-            <w:tcW w:type="dxa" w:w="3628"/>
-          </w:tcPr>
-          <w:p>
-            <w:pPr>
-              <w:spacing w:after="40"/>
-            </w:pPr>
-            <w:r>
-              <w:rPr>
-                <w:rFonts w:ascii="Consolas" w:hAnsi="Consolas" w:cs="Consolas"/>
-                <w:color w:val="000000"/>
-                <w:sz w:val="19"/>
-              </w:rPr>
-              <w:t>Quantity_Was_Invalid</w:t>
-            </w:r>
-          </w:p>
-        </w:tc>
-        <w:tc>
-          <w:tcPr>
-            <w:tcW w:type="dxa" w:w="4195"/>
-          </w:tcPr>
-          <w:p>
-            <w:pPr>
-              <w:spacing w:after="40"/>
-            </w:pPr>
-            <w:r>
-              <w:rPr>
-                <w:rFonts w:ascii="Tahoma" w:hAnsi="Tahoma" w:cs="Tahoma"/>
-                <w:color w:val="000000"/>
-                <w:sz w:val="19"/>
-              </w:rPr>
-              <w:t>จำนวนนอกช่วง 1–20 ก่อน clip</w:t>
-            </w:r>
-          </w:p>
-        </w:tc>
-        <w:tc>
-          <w:tcPr>
-            <w:tcW w:type="dxa" w:w="1701"/>
-          </w:tcPr>
-          <w:p>
-            <w:pPr>
-              <w:spacing w:after="40"/>
-            </w:pPr>
-            <w:r>
-              <w:rPr>
-                <w:rFonts w:ascii="Tahoma" w:hAnsi="Tahoma" w:cs="Tahoma"/>
-                <w:color w:val="000000"/>
-                <w:sz w:val="19"/>
-              </w:rPr>
-              <w:t>3</w:t>
-            </w:r>
-          </w:p>
-        </w:tc>
-      </w:tr>
-      <w:tr>
-        <w:tc>
-          <w:tcPr>
-            <w:tcW w:type="dxa" w:w="3628"/>
-          </w:tcPr>
-          <w:p>
-            <w:pPr>
-              <w:spacing w:after="40"/>
-            </w:pPr>
-            <w:r>
-              <w:rPr>
-                <w:rFonts w:ascii="Consolas" w:hAnsi="Consolas" w:cs="Consolas"/>
-                <w:color w:val="000000"/>
-                <w:sz w:val="19"/>
-              </w:rPr>
-              <w:t>Expected_Amount</w:t>
-            </w:r>
-            <w:r>
-              <w:rPr>
-                <w:rFonts w:ascii="Tahoma" w:hAnsi="Tahoma" w:cs="Tahoma"/>
-                <w:color w:val="000000"/>
-                <w:sz w:val="19"/>
-              </w:rPr>
-              <w:t xml:space="preserve"> / </w:t>
-            </w:r>
-            <w:r>
-              <w:rPr>
-                <w:rFonts w:ascii="Consolas" w:hAnsi="Consolas" w:cs="Consolas"/>
-                <w:color w:val="000000"/>
-                <w:sz w:val="19"/>
-              </w:rPr>
-              <w:t>Amount_Difference</w:t>
-            </w:r>
-            <w:r>
-              <w:rPr>
-                <w:rFonts w:ascii="Tahoma" w:hAnsi="Tahoma" w:cs="Tahoma"/>
-                <w:color w:val="000000"/>
-                <w:sz w:val="19"/>
-              </w:rPr>
-              <w:t xml:space="preserve"> / </w:t>
-            </w:r>
-            <w:r>
-              <w:rPr>
-                <w:rFonts w:ascii="Consolas" w:hAnsi="Consolas" w:cs="Consolas"/>
-                <w:color w:val="000000"/>
-                <w:sz w:val="19"/>
-              </w:rPr>
-              <w:t>Accuracy_Flag</w:t>
-            </w:r>
-          </w:p>
-        </w:tc>
-        <w:tc>
-          <w:tcPr>
-            <w:tcW w:type="dxa" w:w="4195"/>
-          </w:tcPr>
-          <w:p>
-            <w:pPr>
-              <w:spacing w:after="40"/>
-            </w:pPr>
-            <w:r>
-              <w:rPr>
-                <w:rFonts w:ascii="Tahoma" w:hAnsi="Tahoma" w:cs="Tahoma"/>
-                <w:color w:val="000000"/>
-                <w:sz w:val="19"/>
-              </w:rPr>
-              <w:t>ยอดตามสูตร ผลต่าง และธงว่าไม่ตรงสูตรเกิน 1 บาท</w:t>
-            </w:r>
-          </w:p>
-        </w:tc>
-        <w:tc>
-          <w:tcPr>
-            <w:tcW w:type="dxa" w:w="1701"/>
-          </w:tcPr>
-          <w:p>
-            <w:pPr>
-              <w:spacing w:after="40"/>
-            </w:pPr>
-            <w:r>
-              <w:rPr>
-                <w:rFonts w:ascii="Tahoma" w:hAnsi="Tahoma" w:cs="Tahoma"/>
-                <w:color w:val="000000"/>
-                <w:sz w:val="19"/>
-              </w:rPr>
-              <w:t>49</w:t>
-            </w:r>
-          </w:p>
-        </w:tc>
-      </w:tr>
-      <w:tr>
-        <w:tc>
-          <w:tcPr>
-            <w:tcW w:type="dxa" w:w="3628"/>
-          </w:tcPr>
-          <w:p>
-            <w:pPr>
-              <w:spacing w:after="40"/>
-            </w:pPr>
-            <w:r>
-              <w:rPr>
-                <w:rFonts w:ascii="Consolas" w:hAnsi="Consolas" w:cs="Consolas"/>
-                <w:color w:val="000000"/>
-                <w:sz w:val="19"/>
-              </w:rPr>
-              <w:t>Amount_Was_Negative</w:t>
-            </w:r>
-          </w:p>
-        </w:tc>
-        <w:tc>
-          <w:tcPr>
-            <w:tcW w:type="dxa" w:w="4195"/>
-          </w:tcPr>
-          <w:p>
-            <w:pPr>
-              <w:spacing w:after="40"/>
-            </w:pPr>
-            <w:r>
-              <w:rPr>
-                <w:rFonts w:ascii="Tahoma" w:hAnsi="Tahoma" w:cs="Tahoma"/>
-                <w:color w:val="000000"/>
-                <w:sz w:val="19"/>
-              </w:rPr>
-              <w:t>ยอดติดลบ (ไม่แก้ค่า)</w:t>
-            </w:r>
-          </w:p>
-        </w:tc>
-        <w:tc>
-          <w:tcPr>
-            <w:tcW w:type="dxa" w:w="1701"/>
-          </w:tcPr>
-          <w:p>
-            <w:pPr>
-              <w:spacing w:after="40"/>
-            </w:pPr>
-            <w:r>
-              <w:rPr>
-                <w:rFonts w:ascii="Tahoma" w:hAnsi="Tahoma" w:cs="Tahoma"/>
-                <w:color w:val="000000"/>
-                <w:sz w:val="19"/>
-              </w:rPr>
-              <w:t>2</w:t>
-            </w:r>
-          </w:p>
-        </w:tc>
-      </w:tr>
-      <w:tr>
-        <w:tc>
-          <w:tcPr>
-            <w:tcW w:type="dxa" w:w="3628"/>
-          </w:tcPr>
-          <w:p>
-            <w:pPr>
-              <w:spacing w:after="40"/>
-            </w:pPr>
-            <w:r>
-              <w:rPr>
-                <w:rFonts w:ascii="Consolas" w:hAnsi="Consolas" w:cs="Consolas"/>
-                <w:color w:val="000000"/>
-                <w:sz w:val="19"/>
-              </w:rPr>
-              <w:t>Amount_Looks_Like_Sentinel</w:t>
-            </w:r>
-          </w:p>
-        </w:tc>
-        <w:tc>
-          <w:tcPr>
-            <w:tcW w:type="dxa" w:w="4195"/>
-          </w:tcPr>
-          <w:p>
-            <w:pPr>
-              <w:spacing w:after="40"/>
-            </w:pPr>
-            <w:r>
-              <w:rPr>
-                <w:rFonts w:ascii="Tahoma" w:hAnsi="Tahoma" w:cs="Tahoma"/>
-                <w:color w:val="000000"/>
-                <w:sz w:val="19"/>
-              </w:rPr>
-              <w:t>ยอดเป็นเลขหลักเดียวซ้ำ 6 หลัก</w:t>
-            </w:r>
-          </w:p>
-        </w:tc>
-        <w:tc>
-          <w:tcPr>
-            <w:tcW w:type="dxa" w:w="1701"/>
-          </w:tcPr>
-          <w:p>
-            <w:pPr>
-              <w:spacing w:after="40"/>
-            </w:pPr>
-            <w:r>
-              <w:rPr>
-                <w:rFonts w:ascii="Tahoma" w:hAnsi="Tahoma" w:cs="Tahoma"/>
-                <w:color w:val="000000"/>
-                <w:sz w:val="19"/>
-              </w:rPr>
-              <w:t>4</w:t>
-            </w:r>
-          </w:p>
-        </w:tc>
-      </w:tr>
-      <w:tr>
-        <w:tc>
-          <w:tcPr>
-            <w:tcW w:type="dxa" w:w="3628"/>
-          </w:tcPr>
-          <w:p>
-            <w:pPr>
-              <w:spacing w:after="40"/>
-            </w:pPr>
-            <w:r>
-              <w:rPr>
-                <w:rFonts w:ascii="Consolas" w:hAnsi="Consolas" w:cs="Consolas"/>
-                <w:color w:val="000000"/>
-                <w:sz w:val="19"/>
-              </w:rPr>
-              <w:t>Status_Was_Invalid</w:t>
-            </w:r>
-          </w:p>
-        </w:tc>
-        <w:tc>
-          <w:tcPr>
-            <w:tcW w:type="dxa" w:w="4195"/>
-          </w:tcPr>
-          <w:p>
-            <w:pPr>
-              <w:spacing w:after="40"/>
-            </w:pPr>
-            <w:r>
-              <w:rPr>
-                <w:rFonts w:ascii="Tahoma" w:hAnsi="Tahoma" w:cs="Tahoma"/>
-                <w:color w:val="000000"/>
-                <w:sz w:val="19"/>
-              </w:rPr>
-              <w:t>สถานะไม่อยู่ในชุดมาตรฐานก่อน standardize</w:t>
-            </w:r>
-          </w:p>
-        </w:tc>
-        <w:tc>
-          <w:tcPr>
-            <w:tcW w:type="dxa" w:w="1701"/>
-          </w:tcPr>
-          <w:p>
-            <w:pPr>
-              <w:spacing w:after="40"/>
-            </w:pPr>
-            <w:r>
-              <w:rPr>
-                <w:rFonts w:ascii="Tahoma" w:hAnsi="Tahoma" w:cs="Tahoma"/>
-                <w:color w:val="000000"/>
-                <w:sz w:val="19"/>
-              </w:rPr>
-              <w:t>16</w:t>
-            </w:r>
-          </w:p>
-        </w:tc>
-      </w:tr>
-      <w:tr>
-        <w:tc>
-          <w:tcPr>
-            <w:tcW w:type="dxa" w:w="3628"/>
-          </w:tcPr>
-          <w:p>
-            <w:pPr>
-              <w:spacing w:after="40"/>
-            </w:pPr>
-            <w:r>
-              <w:rPr>
-                <w:rFonts w:ascii="Consolas" w:hAnsi="Consolas" w:cs="Consolas"/>
-                <w:color w:val="000000"/>
-                <w:sz w:val="19"/>
-              </w:rPr>
-              <w:t>Transaction_Amount_Before_Capping</w:t>
-            </w:r>
-          </w:p>
-        </w:tc>
-        <w:tc>
-          <w:tcPr>
-            <w:tcW w:type="dxa" w:w="4195"/>
-          </w:tcPr>
-          <w:p>
-            <w:pPr>
-              <w:spacing w:after="40"/>
-            </w:pPr>
-            <w:r>
-              <w:rPr>
-                <w:rFonts w:ascii="Tahoma" w:hAnsi="Tahoma" w:cs="Tahoma"/>
-                <w:color w:val="000000"/>
-                <w:sz w:val="19"/>
-              </w:rPr>
-              <w:t>ยอดก่อน capping (ใช้กู้คืนได้)</w:t>
-            </w:r>
-          </w:p>
-        </w:tc>
-        <w:tc>
-          <w:tcPr>
-            <w:tcW w:type="dxa" w:w="1701"/>
-          </w:tcPr>
-          <w:p>
-            <w:pPr>
-              <w:spacing w:after="40"/>
-            </w:pPr>
-            <w:r>
-              <w:rPr>
-                <w:rFonts w:ascii="Tahoma" w:hAnsi="Tahoma" w:cs="Tahoma"/>
-                <w:color w:val="000000"/>
-                <w:sz w:val="19"/>
-              </w:rPr>
-              <w:t>ทุกแถว</w:t>
-            </w:r>
-          </w:p>
-        </w:tc>
-      </w:tr>
-      <w:tr>
-        <w:tc>
-          <w:tcPr>
-            <w:tcW w:type="dxa" w:w="3628"/>
-          </w:tcPr>
-          <w:p>
-            <w:pPr>
-              <w:spacing w:after="40"/>
-            </w:pPr>
-            <w:r>
-              <w:rPr>
-                <w:rFonts w:ascii="Consolas" w:hAnsi="Consolas" w:cs="Consolas"/>
-                <w:color w:val="000000"/>
-                <w:sz w:val="19"/>
-              </w:rPr>
-              <w:t>Outlier_Flag_Before_Capping</w:t>
-            </w:r>
-          </w:p>
-        </w:tc>
-        <w:tc>
-          <w:tcPr>
-            <w:tcW w:type="dxa" w:w="4195"/>
-          </w:tcPr>
-          <w:p>
-            <w:pPr>
-              <w:spacing w:after="40"/>
-            </w:pPr>
-            <w:r>
-              <w:rPr>
-                <w:rFonts w:ascii="Tahoma" w:hAnsi="Tahoma" w:cs="Tahoma"/>
-                <w:color w:val="000000"/>
-                <w:sz w:val="19"/>
-              </w:rPr>
-              <w:t>อยู่นอกขอบเขต IQR</w:t>
-            </w:r>
-          </w:p>
-        </w:tc>
-        <w:tc>
-          <w:tcPr>
-            <w:tcW w:type="dxa" w:w="1701"/>
-          </w:tcPr>
-          <w:p>
-            <w:pPr>
-              <w:spacing w:after="40"/>
-            </w:pPr>
-            <w:r>
-              <w:rPr>
-                <w:rFonts w:ascii="Tahoma" w:hAnsi="Tahoma" w:cs="Tahoma"/>
-                <w:color w:val="000000"/>
-                <w:sz w:val="19"/>
-              </w:rPr>
-              <w:t>25</w:t>
-            </w:r>
-          </w:p>
-        </w:tc>
-      </w:tr>
-      <w:tr>
-        <w:tc>
-          <w:tcPr>
-            <w:tcW w:type="dxa" w:w="3628"/>
-          </w:tcPr>
-          <w:p>
-            <w:pPr>
-              <w:spacing w:after="40"/>
-            </w:pPr>
-            <w:r>
-              <w:rPr>
-                <w:rFonts w:ascii="Consolas" w:hAnsi="Consolas" w:cs="Consolas"/>
-                <w:color w:val="000000"/>
-                <w:sz w:val="19"/>
-              </w:rPr>
-              <w:t>Amount_Was_Capped</w:t>
-            </w:r>
-          </w:p>
-        </w:tc>
-        <w:tc>
-          <w:tcPr>
-            <w:tcW w:type="dxa" w:w="4195"/>
-          </w:tcPr>
-          <w:p>
-            <w:pPr>
-              <w:spacing w:after="40"/>
-            </w:pPr>
-            <w:r>
-              <w:rPr>
-                <w:rFonts w:ascii="Tahoma" w:hAnsi="Tahoma" w:cs="Tahoma"/>
-                <w:color w:val="000000"/>
-                <w:sz w:val="19"/>
-              </w:rPr>
-              <w:t>ถูก capping จริง (ไม่ใช่โปรโมชัน)</w:t>
-            </w:r>
-          </w:p>
-        </w:tc>
-        <w:tc>
-          <w:tcPr>
-            <w:tcW w:type="dxa" w:w="1701"/>
-          </w:tcPr>
-          <w:p>
-            <w:pPr>
-              <w:spacing w:after="40"/>
-            </w:pPr>
-            <w:r>
-              <w:rPr>
-                <w:rFonts w:ascii="Tahoma" w:hAnsi="Tahoma" w:cs="Tahoma"/>
-                <w:color w:val="000000"/>
-                <w:sz w:val="19"/>
-              </w:rPr>
-              <w:t>19</w:t>
-            </w:r>
-          </w:p>
-        </w:tc>
-      </w:tr>
-      <w:tr>
-        <w:tc>
-          <w:tcPr>
-            <w:tcW w:type="dxa" w:w="3628"/>
-          </w:tcPr>
-          <w:p>
-            <w:pPr>
-              <w:spacing w:after="40"/>
-            </w:pPr>
-            <w:r>
-              <w:rPr>
-                <w:rFonts w:ascii="Consolas" w:hAnsi="Consolas" w:cs="Consolas"/>
-                <w:color w:val="000000"/>
-                <w:sz w:val="19"/>
-              </w:rPr>
-              <w:t>Load_Delay_Hours</w:t>
-            </w:r>
-            <w:r>
-              <w:rPr>
-                <w:rFonts w:ascii="Tahoma" w:hAnsi="Tahoma" w:cs="Tahoma"/>
-                <w:color w:val="000000"/>
-                <w:sz w:val="19"/>
-              </w:rPr>
-              <w:t xml:space="preserve"> / </w:t>
-            </w:r>
-            <w:r>
-              <w:rPr>
-                <w:rFonts w:ascii="Consolas" w:hAnsi="Consolas" w:cs="Consolas"/>
-                <w:color w:val="000000"/>
-                <w:sz w:val="19"/>
-              </w:rPr>
-              <w:t>Timeliness_Status</w:t>
-            </w:r>
-          </w:p>
-        </w:tc>
-        <w:tc>
-          <w:tcPr>
-            <w:tcW w:type="dxa" w:w="4195"/>
-          </w:tcPr>
-          <w:p>
-            <w:pPr>
-              <w:spacing w:after="40"/>
-            </w:pPr>
-            <w:r>
-              <w:rPr>
-                <w:rFonts w:ascii="Tahoma" w:hAnsi="Tahoma" w:cs="Tahoma"/>
-                <w:color w:val="000000"/>
-                <w:sz w:val="19"/>
-              </w:rPr>
-              <w:t>ระยะเวลาจากสั่งซื้อถึงโหลดเข้าคลัง และป้าย On Time/Late</w:t>
-            </w:r>
-          </w:p>
-        </w:tc>
-        <w:tc>
-          <w:tcPr>
-            <w:tcW w:type="dxa" w:w="1701"/>
-          </w:tcPr>
-          <w:p>
-            <w:pPr>
-              <w:spacing w:after="40"/>
-            </w:pPr>
-            <w:r>
-              <w:rPr>
-                <w:rFonts w:ascii="Tahoma" w:hAnsi="Tahoma" w:cs="Tahoma"/>
-                <w:color w:val="000000"/>
-                <w:sz w:val="19"/>
-              </w:rPr>
-              <w:t>Late 38</w:t>
-            </w:r>
-          </w:p>
-        </w:tc>
-      </w:tr>
-    </w:tbl>
-    <w:p>
-      <w:pPr>
-        <w:spacing w:after="0"/>
-      </w:pPr>
     </w:p>
     <w:sectPr>
       <w:pgSz w:w="12240" w:h="15840"/>

</xml_diff>